<commit_message>
align manuscript layers and update architecture figure
</commit_message>
<xml_diff>
--- a/论文/GriddingMachine论文初稿_v0.3_语言优化版.docx
+++ b/论文/GriddingMachine论文初稿_v0.3_语言优化版.docx
@@ -82,7 +82,7 @@
         <w:rPr>
           <w:rFonts w:ascii="Times New Roman" w:hAnsi="Times New Roman" w:eastAsia="宋体"/>
         </w:rPr>
-        <w:t>地球系统模型依赖来自不同机构和产品体系的全球网格数据。即使数据已采用NetCDF等标准格式，源数据处理规则、标准产品标识、网络分发副本与模型实际输入仍可能由不同环节分别维护，给持续更新和可核验调用带来困难。本文在2022版GriddingMachine基础上，将数据生产、产品登记与分发、模型输入组织重构为连续的数据生命周期。生产端以共享YAML配置规范驱动源维度映射、坐标与数值变换、缺失值处理和质量控制；分发端以独立目录维护逻辑标签、镜像及完整性元数据，并通过直接NetCDF和事务式获取对已登记完整性字段的产品进行字节数与SHA-256核验；应用端以统一读取、陆面参数融合和气象驱动组织连接标准产品与模型接口。NOAA OISST V2.1由四维源结构转换为1440×720标准网格，691 150个有效格点与独立参考逐点一致。对于ELEV和LAI两个内部压缩产品，直接NetCDF在环境A中分别降低48.3%和82.9%的缓存预热端到端中位时间，在环境B中分别降低53.6%和69.2%。校园网内4个代表性产品经FTP和Zenodo完成24次同文件下载，文件大小与SHA-256均与目录登记值一致。14类陆面产品和8类ERA5逐时产品在US-NR1形成模型参数和气象驱动，8个字段的8784个时间步与底层NetCDF逐点一致，并完成Emerald初始化和60 s首步。结果表明，新版GriddingMachine能够连接异构源数据生产、标准产品登记、内容完整性核验和模型输入组织，形成面向地球系统模型的可执行数据生命周期，为全球网格数据产品的持续维护与复用提供轻量化基础设施。</w:t>
+        <w:t>地球系统模型依赖来自不同机构和产品体系的全球网格数据。即使数据已采用NetCDF等标准格式，源数据处理规则、标准产品标识、网络分发副本与模型实际输入仍可能由不同环节分别维护，给持续更新和可核验调用带来困难。本文在2022版GriddingMachine基础上，将数据生产、产品登记与分发、模型输入组织重构为连续的数据生命周期。数据生产与标准化层以共享YAML配置规范驱动源维度映射、坐标与数值变换、缺失值处理和质量控制；数据目录与可信分发层以独立目录维护逻辑标签、镜像及完整性元数据，并通过直接NetCDF和事务式获取对已登记完整性字段的产品进行字节数与SHA-256核验；模型输入组织层以统一读取、陆面参数融合和气象驱动组织连接标准产品与模型接口。NOAA OISST V2.1由四维源结构转换为1440×720标准网格，691 150个有效格点与独立参考逐点一致。对于ELEV和LAI两个内部压缩产品，直接NetCDF在环境A中分别降低48.3%和82.9%的缓存预热端到端中位时间，在环境B中分别降低53.6%和69.2%。校园网内4个代表性产品经FTP和Zenodo完成24次同文件下载，文件大小与SHA-256均与目录登记值一致。14类陆面产品和8类ERA5逐时产品在US-NR1形成模型参数和气象驱动，8个字段的8784个时间步与底层NetCDF逐点一致，并完成Emerald初始化和60 s首步。结果表明，新版GriddingMachine能够连接异构源数据生产、标准产品登记、内容完整性核验和模型输入组织，形成面向地球系统模型的可执行数据生命周期，为全球网格数据产品的持续维护与复用提供轻量化基础设施。</w:t>
       </w:r>
     </w:p>
     <w:p>
@@ -164,7 +164,7 @@
         <w:rPr>
           <w:rFonts w:ascii="Times New Roman" w:hAnsi="Times New Roman" w:eastAsia="宋体"/>
         </w:rPr>
-        <w:t>Earth system models depend on global gridded datasets maintained by different institutions and product systems. Even when standardized formats such as NetCDF are used, source-processing rules, standardized product identities, network replicas, and the data structures actually consumed by models may evolve in separate maintenance layers. Building on the 2022 release, this study reorganizes GriddingMachine into a continuous data lifecycle spanning production, product registration and distribution, and model-input organization. A shared YAML contract drives source-dimension mapping, coordinate and numerical transformations, missing-value treatment, and quality control. An independent catalog manages logical labels, mirrors, and integrity metadata, while direct NetCDF and transactional acquisition verify file size and SHA-256 for entries that carry integrity records. Unified reading, land-parameter assembly, and meteorological forcing organization connect standardized products to model interfaces. NOAA OISST V2.1 was transformed from a four-dimensional source layout to a standardized 1440 × 720 grid, with 691,150 finite cells matching an independently decoded reference point by point. For the internally compressed ELEV and LAI products, direct NetCDF reduced median warm-cache end-to-end time by 48.3% and 82.9%, respectively, in environment A and by 53.6% and 69.2% in environment B. Four representative products were downloaded 24 times from FTP and Zenodo on the campus network, with file sizes and SHA-256 digests matching catalog records. Fourteen land products and eight hourly ERA5 products supplied model parameters and forcing for US-NR1; all 8,784 time steps in eight fields matched direct NetCDF reads, and Emerald initialization and a 60 s first step completed with finite states. The updated GriddingMachine connects heterogeneous-source production, standardized-product registration, integrity-verified acquisition, and model-input organization into an executable lifecycle for Earth system modeling.</w:t>
+        <w:t>Earth system models depend on global gridded datasets maintained by different institutions and product systems. Even when standardized formats such as NetCDF are used, source-processing rules, standardized product identities, network replicas, and the data structures actually consumed by models may evolve in separate maintenance layers. Building on the 2022 release, this study reorganizes GriddingMachine into a continuous data lifecycle comprising a data production and standardization layer, a catalog and trusted-distribution layer, and a model-input organization layer. A shared YAML contract drives source-dimension mapping, coordinate and numerical transformations, missing-value treatment, and quality control. An independent catalog manages logical labels, mirrors, and integrity metadata, while direct NetCDF and transactional acquisition verify file size and SHA-256 for entries that carry integrity records. Unified reading, land-parameter assembly, and meteorological forcing organization connect standardized products to model interfaces. NOAA OISST V2.1 was transformed from a four-dimensional source layout to a standardized 1440 × 720 grid, with 691,150 finite cells matching an independently decoded reference point by point. For the internally compressed ELEV and LAI products, direct NetCDF reduced median warm-cache end-to-end time by 48.3% and 82.9%, respectively, in environment A and by 53.6% and 69.2% in environment B. Four representative products were downloaded 24 times from FTP and Zenodo on the campus network, with file sizes and SHA-256 digests matching catalog records. Fourteen land products and eight hourly ERA5 products supplied model parameters and forcing for US-NR1; all 8,784 time steps in eight fields matched direct NetCDF reads, and Emerald initialization and a 60 s first step completed with finite states. The updated GriddingMachine connects heterogeneous-source production, standardized-product registration, integrity-verified acquisition, and model-input organization into an executable lifecycle for Earth system modeling.</w:t>
       </w:r>
     </w:p>
     <w:p>
@@ -206,7 +206,7 @@
         <w:rPr>
           <w:rFonts w:ascii="Times New Roman" w:hAnsi="Times New Roman" w:eastAsia="宋体"/>
         </w:rPr>
-        <w:t>科学数据管理正在由单纯的数据公开转向强调可发现、可获取、可互操作和可复用的FAIR原则[1]。NetCDF具有自描述、跨系统和适合多维数组等特点，CF元数据约定进一步通过坐标、物理量、单位和时空属性促进不同数据源之间的解释与处理[2]。Google Earth Engine等云平台显著提升了大尺度遥感数据的访问和分析能力[3]。机构服务器、团队存储和公共存储共同构成当前地学数据分发生态。这些标准与平台分别改善了数据表达、发现、计算或访问，但对于面向固定版本、离线缓存和模型直接调用的工作流，仍需要把数据转换规则、标准产品身份、网络获取内容和下游模型接口连接起来。</w:t>
+        <w:t>科学数据管理正在由单纯的数据公开转向强调可发现、可获取、可互操作和可复用的FAIR原则[1]。NetCDF具有自描述、跨系统和适合多维数组等特点，CF元数据约定进一步通过坐标、物理量、单位和时空属性促进不同数据源之间的解释与处理[2]。Google Earth Engine等云平台显著提升了大尺度遥感数据的访问和分析能力[3]。机构服务器、团队存储和公共存储共同构成当前地学数据分发生态。这些标准与平台分别改善了数据表达、发现、计算或访问，但对于面向固定版本、离线缓存和模型直接调用的工作流，仍需要把数据转换规则、标准产品标识、网络获取内容和下游模型接口连接起来。</w:t>
       </w:r>
     </w:p>
     <w:p>
@@ -250,7 +250,7 @@
         <w:rPr>
           <w:rFonts w:ascii="Times New Roman" w:hAnsi="Times New Roman" w:eastAsia="宋体"/>
         </w:rPr>
-        <w:t>围绕这一问题，新版GriddingMachine形成三个相互衔接的机制。第一，生产端以共享YAML配置规范表达源维度、坐标、数值变换、Gapfill和质量控制，使异构源到标准NetCDF的转换规则成为可执行生产契约。第二，分发端将数据目录与访问软件解耦，以逻辑标签连接发布副本，并通过直接NetCDF与事务式获取组织下载路径；对于登记了文件字节数和SHA-256的条目，下载端进一步执行严格内容核验以维护可验证的产品身份。第三，应用端以稳定标签连接统一读取、陆面参数融合和气象驱动组织，使标准产品形成满足本文所定义模型输入接口要求的数据结构。三者共同构成“异构数据生产—产品登记与完整性核验—模型输入组织”的连续路径。</w:t>
+        <w:t>围绕这一问题，新版GriddingMachine形成三个相互衔接的功能层。第一，数据生产与标准化层以共享YAML配置规范表达源维度、坐标、数值变换、Gapfill和质量控制，使异构源到标准NetCDF的转换规则成为可执行生产契约。第二，数据目录与可信分发层将数据目录与访问软件解耦，以逻辑标签连接发布副本，并通过直接NetCDF与事务式获取组织下载路径；对于登记了文件字节数和SHA-256的条目，获取流程进一步执行严格内容核验以维护稳定产品标识。第三，模型输入组织层以稳定标签连接统一读取、陆面参数融合和气象驱动组织，使标准产品形成满足模型接口要求的数据结构。三层共同构成“异构数据生产—产品登记与完整性核验—模型输入组织”的连续路径。</w:t>
       </w:r>
     </w:p>
     <w:p>
@@ -258,7 +258,7 @@
         <w:rPr>
           <w:rFonts w:ascii="Times New Roman" w:hAnsi="Times New Roman" w:eastAsia="宋体"/>
         </w:rPr>
-        <w:t>本文采用受控实例与真实地学数据分层评价上述路径：以31组生产实例和OISST V2.1产品转换[9]检验标准化规则及真实异构源适配；以ELEV和LAI比较直接NetCDF与外层</w:t>
+        <w:t>本文采用受控实例与真实地学数据分层评价上述路径：以31组生产实例和OISST V2.1数据转换[9]检验标准化规则及真实异构源适配；以ELEV和LAI比较直接NetCDF与外层</w:t>
       </w:r>
       <w:r>
         <w:rPr>
@@ -270,7 +270,7 @@
         <w:rPr>
           <w:rFonts w:ascii="Times New Roman" w:hAnsi="Times New Roman" w:eastAsia="宋体"/>
         </w:rPr>
-        <w:t>的分发路径，并结合13类受控状态及FTP—Zenodo同文件获取检验事务式多镜像机制；以14类陆面产品和8类ERA5逐时产品[10]构成的US-NR1案例检验标准产品到模型输入组织的接口链路。跨操作系统持续集成作为横向验证，用于检查固定依赖条件下核心实现的运行一致性。</w:t>
+        <w:t>的分发路径，并结合13类受控状态场景及FTP—Zenodo同文件获取检验事务式多镜像机制；以14类陆面数据和8类ERA5逐时数据[10]构成的US-NR1案例检验标准NetCDF到模型输入组织的接口链路。跨操作系统持续集成作为横向验证，用于检查固定依赖条件下核心实现的运行一致性。</w:t>
       </w:r>
     </w:p>
     <w:p>
@@ -300,7 +300,7 @@
         <w:rPr>
           <w:rFonts w:ascii="Times New Roman" w:hAnsi="Times New Roman" w:eastAsia="宋体"/>
         </w:rPr>
-        <w:t>GriddingMachine新版围绕三个相互衔接的生命周期层次组织（图1）：生产契约负责把来源、结构和数值约定不同的地学数据转换为标准NetCDF产品；产品身份与分发层负责维护标签、版本、镜像和完整性元数据，并使数据目录能够独立于</w:t>
+        <w:t>GriddingMachine新版围绕三个相互衔接的生命周期层次组织（图1）：数据生产与标准化层负责把来源、结构和数值约定不同的地学数据转换为标准NetCDF；数据目录与可信分发层负责维护标签、版本、镜像和完整性元数据，并使数据目录能够独立于</w:t>
       </w:r>
       <w:r>
         <w:rPr>
@@ -312,7 +312,7 @@
         <w:rPr>
           <w:rFonts w:ascii="Times New Roman" w:hAnsi="Times New Roman" w:eastAsia="宋体"/>
         </w:rPr>
-        <w:t>软件包版本更新；模型输入层负责数据发现、获取、读取以及陆面参数和气象驱动组织。生产端主要由</w:t>
+        <w:t>软件包版本更新；模型输入组织层负责数据发现、获取、读取以及陆面参数和气象驱动组织。数据生产与标准化层主要由</w:t>
       </w:r>
       <w:r>
         <w:rPr>
@@ -324,7 +324,7 @@
         <w:rPr>
           <w:rFonts w:ascii="Times New Roman" w:hAnsi="Times New Roman" w:eastAsia="宋体"/>
         </w:rPr>
-        <w:t>承担，分发与使用端主要由</w:t>
+        <w:t>承担，数据目录与可信分发层及模型输入组织层主要由</w:t>
       </w:r>
       <w:r>
         <w:rPr>
@@ -336,7 +336,7 @@
         <w:rPr>
           <w:rFonts w:ascii="Times New Roman" w:hAnsi="Times New Roman" w:eastAsia="宋体"/>
         </w:rPr>
-        <w:t>承担。三层共同形成“生产—质控—发布—发现—下载—读取—模型调用”的数据生命周期，其中各层通过标准产品和稳定标签衔接，同时保留独立演化的维护边界。</w:t>
+        <w:t>承担。三层共同形成“生产—质控—发布—发现—下载—读取—模型调用”的数据生命周期，其中各层通过标准NetCDF和稳定标签衔接，同时保留独立演化的维护边界。</w:t>
       </w:r>
     </w:p>
     <w:p>
@@ -387,7 +387,7 @@
           <w:rFonts w:ascii="Times New Roman" w:hAnsi="Times New Roman" w:eastAsia="宋体"/>
           <w:b/>
         </w:rPr>
-        <w:t>图1 GriddingMachine从2022版基线到新版端到端工作流的架构更新</w:t>
+        <w:t>图1 GriddingMachine从2022版基线到新版数据生命周期的架构更新</w:t>
       </w:r>
       <w:r>
         <w:rPr>
@@ -417,7 +417,7 @@
         <w:rPr>
           <w:rFonts w:ascii="Times New Roman" w:hAnsi="Times New Roman" w:eastAsia="宋体"/>
         </w:rPr>
-        <w:t>构成数据预处理、分发与读取路径；（b）新版以共享YAML契约连接异构源数据、标准化与质量控制、标准NetCDF产品、独立数据目录、事务式获取以及统一读取和模型调用，形成贯通数据生产、内容完整性可核验分发与模型应用的端到端工作流；（c）O1—O5依次表示统一数据契约、简化数据制品、目录独立演化、事务式获取和模型就绪接口。橙色虚线标示各项更新相对于2022版基线及新版核心节点的对应关系。</w:t>
+        <w:t>构成数据预处理、分发与读取路径；（b）新版由数据生产与标准化层、数据目录与可信分发层和模型输入组织层构成，依次连接异构源数据、共享YAML契约、标准化与质量控制、标准NetCDF、独立数据目录、完整性获取以及统一读取和模型调用；（c）O1—O5依次表示统一数据契约、简化数据制品、目录独立演化、事务式获取和模型就绪接口。橙色虚线标示各项更新相对于2022版基线及新版核心节点的对应关系。</w:t>
       </w:r>
     </w:p>
     <w:p>
@@ -429,7 +429,7 @@
           <w:rFonts w:ascii="Times New Roman" w:hAnsi="Times New Roman" w:eastAsia="宋体"/>
           <w:b/>
         </w:rPr>
-        <w:t>Fig. 1 Architectural updates from the 2022 GriddingMachine baseline to the updated end-to-end workflow.</w:t>
+        <w:t>Fig. 1 Architectural updates from the 2022 GriddingMachine baseline to the updated data lifecycle.</w:t>
       </w:r>
       <w:r>
         <w:rPr>
@@ -459,7 +459,7 @@
         <w:rPr>
           <w:rFonts w:ascii="Times New Roman" w:hAnsi="Times New Roman" w:eastAsia="宋体"/>
         </w:rPr>
-        <w:t xml:space="preserve"> across data preprocessing, distribution, and access. (b) The updated workflow uses a shared YAML contract to connect heterogeneous source data, standardization and quality control, standard NetCDF products, an independent catalog, transactional acquisition, and unified reading and model invocation, thereby integrating data production, transactional distribution with integrity verification, and model application. (c) O1--O5 denote the unified data contract, simplified data artifacts, independent catalog evolution, transactional acquisition, and model-ready interfaces. Orange dashed lines map these updates to the corresponding baseline components and core nodes in the updated workflow.</w:t>
+        <w:t xml:space="preserve"> across data preprocessing, distribution, and access. (b) The updated lifecycle comprises a data production and standardization layer, a catalog and trusted-distribution layer, and a model-input organization layer, connecting heterogeneous source data, a shared YAML contract, standardization and quality control, standard NetCDF data, an independent catalog, integrity-verified acquisition, and unified reading and model invocation. (c) O1--O5 denote the unified data contract, simplified data artifacts, independent catalog evolution, transactional acquisition, and model-ready interfaces. Orange dashed lines map these updates to the corresponding baseline components and core nodes in the updated workflow.</w:t>
       </w:r>
     </w:p>
     <w:p>
@@ -467,7 +467,7 @@
         <w:rPr>
           <w:rFonts w:ascii="Times New Roman" w:hAnsi="Times New Roman" w:eastAsia="宋体"/>
         </w:rPr>
-        <w:t>在生产端，原始数据及其处理规则分别作为数据输入和YAML配置输入。新版使用共享配置规范描述原始文件组合、源变量、经纬度方向、源维度语义、数值变换、有效范围、Gapfill及输出元数据；配置构建器与处理流水线遵循同一规范。生产引擎依据配置枚举输入，依次完成读取、标准化、质量控制和保存，最终生成以统一标签命名的NetCDF产品。维度、坐标、数值和空间方向检查嵌入生产流程，使标准产品在生成阶段即具有清晰的数据语义。</w:t>
+        <w:t>在数据生产与标准化层，原始数据及其处理规则分别作为数据输入和YAML配置输入。新版使用共享配置规范描述原始文件组合、源变量、经纬度方向、源维度语义、数值变换、有效范围、Gapfill及输出元数据；配置构建器与处理流水线遵循同一规范。生产引擎依据配置枚举输入，依次完成读取、标准化、质量控制和保存，最终生成以统一标签命名的NetCDF数据。维度、坐标、数值和空间方向检查嵌入生产流程，使标准数据在生成阶段即具有清晰的数据语义。</w:t>
       </w:r>
     </w:p>
     <w:p>
@@ -483,7 +483,7 @@
         <w:rPr>
           <w:rFonts w:ascii="Times New Roman" w:hAnsi="Times New Roman" w:eastAsia="宋体"/>
         </w:rPr>
-        <w:t>在数据使用端，目录管理模块显式设置数据根目录与目录来源。目录更新经临时文件完成配置规范校验和事务式替换，并保留上一有效版本。产品获取模块提取各镜像地址的主机名，以可获得的平均往返延迟辅助确定候选顺序，同时保留全部镜像并依次回退。每次传输创建独立临时文件。对于登记了</w:t>
+        <w:t>在数据目录与可信分发层，目录管理模块显式设置数据根目录与目录来源。目录更新经临时文件完成配置规范校验和事务式替换，并保留上一有效版本。数据获取模块提取各镜像地址的主机名，以可获得的平均往返延迟辅助确定候选顺序，同时保留全部镜像并依次回退。每次传输创建独立临时文件。对于登记了</w:t>
       </w:r>
       <w:r>
         <w:rPr>
@@ -507,7 +507,7 @@
         <w:rPr>
           <w:rFonts w:ascii="Times New Roman" w:hAnsi="Times New Roman" w:eastAsia="宋体"/>
         </w:rPr>
-        <w:t>的产品，文件通过字节数和摘要核验后进入正式数据目录；历史条目由兼容模式保持标签访问。本文将版本化目录、内容一致的镜像、事务式落盘和内容完整性校验共同构成的获取机制定义为“可信分发”。</w:t>
+        <w:t>的条目，文件通过字节数和摘要核验后进入正式数据目录；历史条目由兼容模式保持标签访问。本文将版本化目录、内容一致的镜像、事务式落盘和内容完整性校验共同构成的获取机制定义为“可信分发”。</w:t>
       </w:r>
     </w:p>
     <w:p>
@@ -515,7 +515,7 @@
         <w:rPr>
           <w:rFonts w:ascii="Times New Roman" w:hAnsi="Times New Roman" w:eastAsia="宋体"/>
         </w:rPr>
-        <w:t>数据读取层提供标签驱动的整场、指定周期及站点读取，并进一步完成格点尺度陆面参数融合与气象驱动组织。由14类产品组成的第二套陆面参数集合（代码标识为</w:t>
+        <w:t>模型输入组织层提供标签驱动的整场、指定周期及站点读取，并进一步完成格点尺度陆面参数融合与气象驱动组织。由14类产品组成的第二套陆面参数集合（代码标识为</w:t>
       </w:r>
       <w:r>
         <w:rPr>
@@ -1232,7 +1232,7 @@
         <w:rPr>
           <w:rFonts w:ascii="Times New Roman" w:hAnsi="Times New Roman" w:eastAsia="宋体"/>
         </w:rPr>
-        <w:t>2.2 YAML驱动的标准数据生产</w:t>
+        <w:t>2.2 YAML驱动的数据生产与标准化</w:t>
       </w:r>
     </w:p>
     <w:p>
@@ -2465,7 +2465,7 @@
         <w:rPr>
           <w:rFonts w:ascii="Times New Roman" w:hAnsi="Times New Roman" w:eastAsia="宋体"/>
         </w:rPr>
-        <w:t>框架同时提供程序化和本地交互式配置生成方式。二者输出均经同一schema校验后进入</w:t>
+        <w:t>框架同时提供程序化和本地交互式配置生成方式。二者输出均经同一配置规范校验后进入</w:t>
       </w:r>
       <w:r>
         <w:rPr>
@@ -2477,7 +2477,7 @@
         <w:rPr>
           <w:rFonts w:ascii="Times New Roman" w:hAnsi="Times New Roman" w:eastAsia="宋体"/>
         </w:rPr>
-        <w:t>，因此贡献入口不再维护一套独立于生产流水线的字段语义。</w:t>
+        <w:t>，使数据贡献入口与生产流水线共享一致的字段语义。</w:t>
       </w:r>
     </w:p>
     <w:p>
@@ -2749,7 +2749,7 @@
         <w:rPr>
           <w:rFonts w:ascii="Times New Roman" w:hAnsi="Times New Roman" w:eastAsia="宋体"/>
         </w:rPr>
-        <w:t>的Collector显式配置数据根目录、目录来源和本地目录文件。远端目录先下载至临时路径，经根节点和字段schema校验后再替换正式目录，并保留上一有效版本。目录条目以标签为键，核心字段包括安全相对路径</w:t>
+        <w:t>的Collector显式配置数据根目录、目录来源和本地目录文件。远端目录先下载至临时路径，经根节点和字段规范校验后再替换正式目录，并保留上一有效版本。目录条目以标签为键，核心字段包括安全相对路径</w:t>
       </w:r>
       <w:r>
         <w:rPr>
@@ -2797,7 +2797,7 @@
         <w:rPr>
           <w:rFonts w:ascii="Times New Roman" w:hAnsi="Times New Roman" w:eastAsia="宋体"/>
         </w:rPr>
-        <w:t>。严格完整性模式要求后两项同时存在，兼容模式保持历史条目的标签访问；目录schema和获取逻辑对多URL与完整性字段采用统一表达。</w:t>
+        <w:t>。严格完整性模式要求后两项同时存在，兼容模式保持历史条目的标签访问；目录规范和获取逻辑对多URL与完整性字段采用统一表达。</w:t>
       </w:r>
     </w:p>
     <w:p>
@@ -2843,7 +2843,7 @@
         <w:rPr>
           <w:rFonts w:ascii="Times New Roman" w:hAnsi="Times New Roman" w:eastAsia="宋体"/>
         </w:rPr>
-        <w:t>标准网格数据读取接口支持以本地NetCDF路径或数据标签访问产品，并提供整场数组、指定周期切片、站点全部周期和站点指定周期4种读取方式。标签对应的产品可由目录模块自动获取；默认返回标准变量</w:t>
+        <w:t>标准网格数据读取接口支持以本地NetCDF路径或数据标签访问数据，并提供整场数组、指定周期切片、站点全部周期和站点指定周期4种读取方式。标签对应的NetCDF可由目录模块自动获取；默认返回标准变量</w:t>
       </w:r>
       <w:r>
         <w:rPr>
@@ -2867,7 +2867,7 @@
         <w:rPr>
           <w:rFonts w:ascii="Times New Roman" w:hAnsi="Times New Roman" w:eastAsia="宋体"/>
         </w:rPr>
-        <w:t>。读取层直接继承生产端统一的单位、缺失值和物理范围，使处理规则集中于共享生产契约，并兼容既有读取方式。</w:t>
+        <w:t>。模型输入组织层直接继承数据生产与标准化层统一的单位、缺失值和物理范围，使处理规则集中于共享生产契约，并兼容既有读取方式。</w:t>
       </w:r>
     </w:p>
     <w:p>
@@ -2887,7 +2887,7 @@
         <w:rPr>
           <w:rFonts w:ascii="Times New Roman" w:hAnsi="Times New Roman" w:eastAsia="宋体"/>
         </w:rPr>
-        <w:t>顺序及西向东、南向北排列为输入契约。接口面向全球规则网格的原位索引，区域投影、非规则网格和空间插值可在生产端完成标准化；周期索引的月份、日期或小时含义由对应产品元数据解释。</w:t>
+        <w:t>顺序及西向东、南向北排列为输入契约。接口面向全球规则网格的原位索引，区域投影、非规则网格和空间插值可在数据生产与标准化层完成转换；周期索引的月份、日期或小时含义由对应数据元数据解释。</w:t>
       </w:r>
     </w:p>
     <w:p>
@@ -3026,7 +3026,7 @@
         <w:rPr>
           <w:rFonts w:ascii="Times New Roman" w:hAnsi="Times New Roman" w:eastAsia="宋体"/>
         </w:rPr>
-        <w:t>标签驱动的数据访问、陆面参数融合与气象驱动组织共同构成模型输入转换层。本文将“模型就绪”具体界定为：标准产品经过格点索引、字段组织、时间轴构建和量纲衔接后，形成满足Emerald初始化接口的数据结构。与2022版通过标签组织数据访问的思路一致[4]，新版进一步把目录配置与更新、完整性获取、标准网格读取和模型输入组织连接为连续公共数据流。用户以数据标签发现产品，经镜像获取，并在目录提供完整性元数据时执行内容核验，再读取整场、周期或格点数据，并形成陆面参数或气象驱动；具体公共接口、调用参数和完整Julia示例列入补充材料与版本化用户指南。</w:t>
+        <w:t>标签驱动的数据访问、陆面参数融合与气象驱动组织共同构成模型输入组织层。本文将“模型就绪”具体界定为：标准产品经过格点索引、字段组织、时间轴构建和量纲衔接后，形成满足Emerald初始化接口的数据结构。与2022版通过标签组织数据访问的思路一致[4]，新版进一步把目录配置与更新、完整性获取、标准网格读取和模型输入组织连接为连续公共数据流。用户以数据标签发现产品，经镜像获取，并在目录提供完整性元数据时执行内容核验，再读取整场、周期或格点数据，并形成陆面参数或气象驱动；具体公共接口、调用参数和完整Julia示例列入补充材料与版本化用户指南。</w:t>
       </w:r>
     </w:p>
     <w:p>
@@ -3178,7 +3178,7 @@
                 <w:rFonts w:ascii="Times New Roman" w:hAnsi="Times New Roman" w:eastAsia="宋体"/>
                 <w:sz w:val="18"/>
               </w:rPr>
-              <w:t>共享生产契约将异构源数据转换为标准产品</w:t>
+              <w:t>数据生产与标准化层将异构源数据转换为标准NetCDF</w:t>
             </w:r>
           </w:p>
         </w:tc>
@@ -3216,7 +3216,7 @@
                 <w:rFonts w:ascii="Times New Roman" w:hAnsi="Times New Roman" w:eastAsia="宋体"/>
                 <w:sz w:val="18"/>
               </w:rPr>
-              <w:t>OISST V2.1真实异构源产品</w:t>
+              <w:t>OISST V2.1真实异构源数据</w:t>
             </w:r>
           </w:p>
         </w:tc>
@@ -3256,7 +3256,7 @@
                 <w:rFonts w:ascii="Times New Roman" w:hAnsi="Times New Roman" w:eastAsia="宋体"/>
                 <w:sz w:val="18"/>
               </w:rPr>
-              <w:t>直接NetCDF与事务式多镜像机制组织高效且内容可核验的产品分发</w:t>
+              <w:t>数据目录与可信分发层组织高效且内容可核验的数据获取</w:t>
             </w:r>
           </w:p>
         </w:tc>
@@ -3275,7 +3275,7 @@
                 <w:rFonts w:ascii="Times New Roman" w:hAnsi="Times New Roman" w:eastAsia="宋体"/>
                 <w:sz w:val="18"/>
               </w:rPr>
-              <w:t>ELEV/LAI回环HTTP对照；13类镜像状态</w:t>
+              <w:t>ELEV/LAI回环HTTP对照；13类受控状态场景</w:t>
             </w:r>
           </w:p>
         </w:tc>
@@ -3348,7 +3348,7 @@
                 <w:rFonts w:ascii="Times New Roman" w:hAnsi="Times New Roman" w:eastAsia="宋体"/>
                 <w:sz w:val="18"/>
               </w:rPr>
-              <w:t>统一应用层将标准产品组织为模型就绪输入</w:t>
+              <w:t>模型输入组织层将标准产品组织为模型就绪输入</w:t>
             </w:r>
           </w:p>
         </w:tc>
@@ -3515,7 +3515,7 @@
         <w:rPr>
           <w:rFonts w:ascii="Times New Roman" w:hAnsi="Times New Roman" w:eastAsia="宋体"/>
         </w:rPr>
-        <w:t>3.1 标准产品生产与OISST案例</w:t>
+        <w:t>3.1 数据生产与标准化及OISST案例</w:t>
       </w:r>
     </w:p>
     <w:p>
@@ -3927,7 +3927,7 @@
         <w:rPr>
           <w:rFonts w:ascii="Times New Roman" w:hAnsi="Times New Roman" w:eastAsia="宋体"/>
         </w:rPr>
-        <w:t>多镜像分析在两个独立环境中构建内容一致、访问状态可配置的镜像集合，通过延迟分数组织候选顺序，并设置13个受控状态场景，覆盖候选排序、镜像回退、网络访问异常、缓存命中、内容完整性异常和候选耗尽过程。每个场景在各环境中重复5次，记录候选选择、镜像遍历、正式文件状态及SHA-256，据此刻画事务式获取在镜像切换过程中的文件选择、校验与落盘行为。校园网FTP与Zenodo访问进一步呈现机构镜像和公共镜像的互补分发特征与内容一致性；完整场景矩阵列于补充材料S6。</w:t>
+        <w:t>多镜像分析在两个独立环境中构建内容一致、访问状态可配置的镜像集合，通过延迟分数组织候选顺序，并设置13类受控状态场景，覆盖候选排序、镜像回退、网络访问异常、缓存命中、内容完整性异常和候选耗尽过程。每类场景在各环境中重复5次，记录候选选择、镜像遍历、正式文件状态及SHA-256，据此刻画事务式获取在镜像切换过程中的文件选择、校验与落盘行为。校园网FTP与Zenodo访问进一步呈现机构镜像和公共镜像的互补分发特征与内容一致性；完整场景矩阵列于补充材料S6。</w:t>
       </w:r>
     </w:p>
     <w:p>
@@ -4010,7 +4010,7 @@
         <w:rPr>
           <w:rFonts w:ascii="Times New Roman" w:hAnsi="Times New Roman" w:eastAsia="宋体"/>
         </w:rPr>
-        <w:t>维度、360×180×8784形状及单位属性。应用层输出与底层NetCDF直接读取的同一格点序列逐点比较；</w:t>
+        <w:t>维度、360×180×8784形状及单位属性。模型输入组织层输出与底层NetCDF直接读取的同一格点序列逐点比较；</w:t>
       </w:r>
       <w:r>
         <w:rPr>
@@ -4041,7 +4041,7 @@
         <w:rPr>
           <w:rFonts w:ascii="Times New Roman" w:hAnsi="Times New Roman" w:eastAsia="宋体"/>
         </w:rPr>
-        <w:t>跨操作系统运行一致性采用本地运行与持续集成相结合的设计。Windows和macOS本地环境运行生产矩阵、ELEV/LAI分发效率、13类镜像状态以及核心软件与Emerald接口；Linux与另外两个系统的干净持续集成环境运行29组非交互生产实例、40次确定性分发测量、65次镜像状态核对、核心软件功能和Emerald最小接口。统一项目依赖与参考数据用于比较产品结构、逐点数值、正式文件摘要和接口状态。</w:t>
+        <w:t>跨操作系统运行一致性采用本地运行与持续集成相结合的设计。Windows和macOS本地环境运行生产矩阵、ELEV/LAI分发效率、13类受控状态场景以及核心软件与Emerald接口；Linux与另外两个系统的干净持续集成环境运行29组非交互生产实例、40次确定性分发测量、65次镜像状态核对、核心软件功能和Emerald最小接口。统一项目依赖与参考数据用于比较数据结构、逐点数值、正式文件摘要和接口状态。</w:t>
       </w:r>
     </w:p>
     <w:p>
@@ -4079,7 +4079,7 @@
         <w:rPr>
           <w:rFonts w:ascii="Times New Roman" w:hAnsi="Times New Roman" w:eastAsia="宋体"/>
         </w:rPr>
-        <w:t>4.1 标准产品生产与OISST结果</w:t>
+        <w:t>4.1 数据生产与标准化及OISST结果</w:t>
       </w:r>
     </w:p>
     <w:p>
@@ -4343,7 +4343,7 @@
         <w:rPr>
           <w:rFonts w:ascii="Times New Roman" w:hAnsi="Times New Roman" w:eastAsia="宋体"/>
         </w:rPr>
-        <w:t>将ELEV和LAI的端到端中位时间分别降低48.3%和82.9%；环境B中的相应降幅分别为53.6%和69.2%。两个产品的传输字节分别增加6.43%和2.16%，逻辑临时占用分别减少约48%和49%。80次SHA-256摘要核验结果一致。对于所测的两个内部压缩产品，直接分发以少量传输字节增加换取了额外解包步骤和临时文件共存的减少。</w:t>
+        <w:t>将ELEV和LAI的端到端中位时间分别降低48.3%和82.9%；环境B中的相应降幅分别为53.6%和69.2%。两个数据文件的传输字节分别增加6.43%和2.16%，逻辑临时占用分别减少约48%和49%。80次SHA-256摘要核验结果一致，体现了减少重复压缩、解包及临时文件共存对缩短数据访问路径的贡献。</w:t>
       </w:r>
     </w:p>
     <w:p>
@@ -4469,7 +4469,7 @@
         <w:rPr>
           <w:rFonts w:ascii="Times New Roman" w:hAnsi="Times New Roman" w:eastAsia="宋体"/>
         </w:rPr>
-        <w:t>13个受控状态场景在两个独立操作系统环境中分别重复5次，共形成130次获取记录。在具有可用延迟分数的场景中，目录与数据获取模块按照延迟辅助排序候选，并在首选镜像访问或内容校验状态变化时依次遍历其余地址。每次获取采用独立临时文件，内容经字节数和SHA-256确认后进入正式路径；所有记录均完成临时文件回收，既有正式文件摘要保持一致。</w:t>
+        <w:t>13类受控状态场景在两个独立操作系统环境中分别重复5次，共形成130次获取记录。在具有可用延迟分数的场景中，目录与数据获取模块按照延迟辅助排序候选，并在首选镜像访问或内容校验状态变化时依次遍历其余地址。每次获取采用独立临时文件，内容经字节数和SHA-256确认后进入正式路径；所有记录均完成临时文件回收，既有正式文件摘要保持一致。</w:t>
       </w:r>
     </w:p>
     <w:p>
@@ -4493,7 +4493,7 @@
         <w:rPr>
           <w:rFonts w:ascii="Times New Roman" w:hAnsi="Times New Roman" w:eastAsia="宋体"/>
         </w:rPr>
-        <w:t>ERA5降水产品的单位修订进一步检验了逻辑标签与物理制品的解耦：逻辑标签</w:t>
+        <w:t>ERA5降水数据的单位修订进一步呈现逻辑标签与物理文件的解耦：逻辑标签</w:t>
       </w:r>
       <w:r>
         <w:rPr>
@@ -4505,7 +4505,7 @@
         <w:rPr>
           <w:rFonts w:ascii="Times New Roman" w:hAnsi="Times New Roman" w:eastAsia="宋体"/>
         </w:rPr>
-        <w:t>保持不变，目录将其物理URL更新为</w:t>
+        <w:t>保持稳定，目录将其物理URL指向</w:t>
       </w:r>
       <w:r>
         <w:rPr>
@@ -4529,7 +4529,7 @@
         <w:rPr>
           <w:rFonts w:ascii="Times New Roman" w:hAnsi="Times New Roman" w:eastAsia="宋体"/>
         </w:rPr>
-        <w:t>与SHA-256，原V1物理文件未被覆盖。全新Collector按V1逻辑标签获取R1制品并通过完整性核验，第二次调用直接复用正式缓存。该案例说明产品修订可以通过目录更新完成，而无需改变下游使用的逻辑标签。</w:t>
+        <w:t>与SHA-256，V1和V1_R1文件以不同后缀并行保留。空缓存Collector实例按V1逻辑标签获取R1文件并通过完整性核验，第二次调用直接复用正式缓存。该案例表明，目录更新能够承接数据修订，同时保持下游逻辑标签和调用接口稳定。</w:t>
       </w:r>
     </w:p>
     <w:p>
@@ -4580,7 +4580,7 @@
         <w:rPr>
           <w:rFonts w:ascii="Times New Roman" w:hAnsi="Times New Roman" w:eastAsia="宋体"/>
         </w:rPr>
-        <w:t>、360×180×8784，并带有单位属性。US-NR1格点的地表气压、降水、漫射与直射短波辐射、长波辐射、气温、水汽压亏缺和风速均得到8784个逐小时值，有限值比例均为100%；应用层输出与底层NetCDF逐点读取的8个字段最大绝对差均为0。按站点经度计算的时区偏移为−7.0364 h，</w:t>
+        <w:t>、360×180×8784，并带有单位属性。US-NR1格点的地表气压、降水、漫射与直射短波辐射、长波辐射、气温、水汽压亏缺和风速均得到8784个逐小时值，有限值比例均为100%；模型输入组织层输出与底层NetCDF逐点读取的8个字段最大绝对差均为0。按站点经度计算的时区偏移为−7.0364 h，</w:t>
       </w:r>
       <w:r>
         <w:rPr>
@@ -4592,7 +4592,7 @@
         <w:rPr>
           <w:rFonts w:ascii="Times New Roman" w:hAnsi="Times New Roman" w:eastAsia="宋体"/>
         </w:rPr>
-        <w:t>严格递增且与独立公式逐点一致。气象组织层形成</w:t>
+        <w:t>严格递增且与独立公式逐点一致。气象驱动组织形成</w:t>
       </w:r>
       <w:r>
         <w:rPr>
@@ -4612,7 +4612,7 @@
         <w:rPr>
           <w:rFonts w:ascii="Times New Roman" w:hAnsi="Times New Roman" w:eastAsia="宋体"/>
         </w:rPr>
-        <w:t>量纲审计进一步表明，PPT全年累计值为0.496409 m水层，即496.409 mm。该数值尺度与ERA5逐小时累计降水的米制表达[11]及Emerald由水层厚度转换为摩尔通量的适配关系一致。本轮更新据此将生产端降水单位属性统一为</w:t>
+        <w:t>量纲审计进一步表明，PPT全年累计值为0.496409 m水层，即496.409 mm。该数值尺度与ERA5逐小时累计降水的米制表达[11]及Emerald由水层厚度转换为摩尔通量的适配关系一致。据此，标准NetCDF中的降水单位属性统一为</w:t>
       </w:r>
       <w:r>
         <w:rPr>
@@ -4624,7 +4624,7 @@
         <w:rPr>
           <w:rFonts w:ascii="Times New Roman" w:hAnsi="Times New Roman" w:eastAsia="宋体"/>
         </w:rPr>
-        <w:t>，使标准产品元数据、数值尺度和模型换算形成一致的量纲链条。真实年度案例由此覆盖格点提取、时间轴构建、量纲衔接和模型首步计算等主要接口环节。</w:t>
+        <w:t>，使数据元信息、数值尺度和模型换算形成一致的量纲链条。真实年度案例由此覆盖格点提取、时间轴构建、量纲衔接和模型首步计算等主要接口环节。</w:t>
       </w:r>
     </w:p>
     <w:p>
@@ -4689,7 +4689,7 @@
         <w:rPr>
           <w:rFonts w:ascii="Times New Roman" w:hAnsi="Times New Roman" w:eastAsia="宋体"/>
         </w:rPr>
-        <w:t>OISST案例说明了这种重构在生产端的具体作用。源变量的单例维度、存储缩放和经度范围由源适配与共享配置共同表达，输出通过独立解码参考核对坐标、有效值掩膜和逐点物理值。31组受控实例解析维度、坐标、数值和Gapfill等基本操作的确定性表现，真实OISST呈现这些机制在实际异构产品中的组合路径。由此，新版将处理规则显式化为可执行、可核对的生产契约，并把标准化流程从数据源专用实现提升为可复用的数据生产方法。</w:t>
+        <w:t>OISST案例说明了这种重构在数据生产与标准化层的具体作用。源变量的单例维度、存储缩放和经度范围由源适配与共享配置共同表达，输出通过独立解码参考核对坐标、有效值掩膜和逐点物理值。31组受控实例解析维度、坐标、数值和Gapfill等基本操作的确定性表现，真实OISST呈现这些机制在实际异构产品中的组合路径。由此，新版将处理规则显式化为可执行、可核对的生产契约，并把标准化流程从数据源专用实现提升为可复用的数据生产方法。</w:t>
       </w:r>
     </w:p>
     <w:p>
@@ -4740,7 +4740,7 @@
         <w:rPr>
           <w:rFonts w:ascii="Times New Roman" w:hAnsi="Times New Roman" w:eastAsia="宋体"/>
         </w:rPr>
-        <w:t>和SHA-256；每个镜像下载到独立临时文件，字节数和摘要与目录一致后进入正式路径。13类受控状态刻画回退、内容变化和缓存条件下的事务行为，真实Zenodo及校园网FTP—Zenodo记录表明代表性网络副本与目录登记内容一致。分发效率与事务式完整性机制由此共同构成新版分发架构的两项互补改进。</w:t>
+        <w:t>和SHA-256；每个镜像下载到独立临时文件，字节数和摘要与目录一致后进入正式路径。13类受控状态场景刻画回退、内容变化和缓存条件下的事务行为，真实Zenodo及校园网FTP—Zenodo记录表明代表性网络副本与目录登记内容一致。分发效率与事务式完整性机制由此共同构成新版分发架构的两项互补改进。</w:t>
       </w:r>
     </w:p>
     <w:p>
@@ -4748,7 +4748,7 @@
         <w:rPr>
           <w:rFonts w:ascii="Times New Roman" w:hAnsi="Times New Roman" w:eastAsia="宋体"/>
         </w:rPr>
-        <w:t>ERA5降水V1→V1_R1修订展示了独立目录的另一项作用：模型侧继续使用原逻辑标签，而物理制品、URL及完整性摘要在目录层更新。目录记录和原始制品共同保留版本边界，使数据修订与下游接口保持解耦，同时由新的摘要锁定修订后的具体bitstream。</w:t>
+        <w:t>ERA5降水V1→V1_R1修订展示了独立目录的另一项作用：模型侧继续使用稳定逻辑标签，物理文件、URL及完整性摘要在目录层更新。目录记录与带修订后缀的文件共同保留版本关系，使数据修订与下游接口保持解耦，并由新的摘要锁定修订后的文件内容。</w:t>
       </w:r>
     </w:p>
     <w:p>
@@ -4767,7 +4767,7 @@
         <w:rPr>
           <w:rFonts w:ascii="Times New Roman" w:hAnsi="Times New Roman" w:eastAsia="宋体"/>
         </w:rPr>
-        <w:t>生产质量控制与分发完整性核验形成互补。生产阶段通过维度、坐标方向、变量、数值范围、Gapfill、空间方向图和独立参考等检查，确认标准产品符合声明的处理规则；分发阶段通过文件字节数和SHA-256确认下载对象与目录登记的标准文件内容一致。源数据属性、处理规则、变量物理意义和量纲继续在生产与应用层接受对应检查。OISST的逐点独立参考和ERA5降水单位修订体现了两类机制在数据生命周期中的协同作用。</w:t>
+        <w:t>生产质量控制与分发完整性核验形成互补。数据生产与标准化层通过维度、坐标方向、变量、数值范围、Gapfill、空间方向图和独立参考等检查，确认标准数据符合声明的处理规则；数据目录与可信分发层通过文件字节数和SHA-256确认下载对象与目录登记的标准文件内容一致。源数据属性、处理规则、变量物理意义和量纲继续在数据生产与标准化层与模型输入组织层接受对应检查。OISST的逐点独立参考和ERA5降水单位修订体现了两类机制在数据生命周期中的协同作用。</w:t>
       </w:r>
     </w:p>
     <w:p>
@@ -4794,7 +4794,7 @@
         <w:rPr>
           <w:rFonts w:ascii="Times New Roman" w:hAnsi="Times New Roman" w:eastAsia="宋体"/>
         </w:rPr>
-        <w:t>标准化NetCDF是模型输入组织的起点。地球系统模型还需要把多个产品映射到共同格点，组合参数字段，建立时间轴，并衔接变量单位和模型接口所需的数据结构。US-NR1案例中，14类陆面产品形成34个模型字段，8类ERA5产品形成8784步逐时气象序列；应用层字段与底层NetCDF逐点一致，FDOY与独立时间公式一致，降水单位与模型水量换算相衔接。真实陆面参数和气象驱动随后完成Emerald初始化和60 s首步计算。</w:t>
+        <w:t>标准化NetCDF是模型输入组织的起点。地球系统模型还需要把多个产品映射到共同格点，组合参数字段，建立时间轴，并衔接变量单位和模型接口所需的数据结构。US-NR1案例中，14类陆面产品形成34个模型字段，8类ERA5产品形成8784步逐时气象序列；模型输入组织层字段与底层NetCDF逐点一致，FDOY与独立时间公式一致，降水单位与模型水量换算相衔接。真实陆面参数和气象驱动随后完成Emerald初始化和60 s首步计算。</w:t>
       </w:r>
     </w:p>
     <w:p>
@@ -4867,7 +4867,7 @@
         <w:rPr>
           <w:rFonts w:ascii="Times New Roman" w:hAnsi="Times New Roman" w:eastAsia="宋体"/>
         </w:rPr>
-        <w:t>本文在2022版GriddingMachine统一网格、标签访问和artifact数据管理基础上，将数据生产、产品登记与分发、模型输入组织重新连接为可执行的数据生命周期。新版以共享YAML配置规范和显式源维度映射描述异构源到标准产品的生产契约，以独立目录、直接NetCDF、事务式获取和</w:t>
+        <w:t>本文在2022版GriddingMachine统一网格、标签访问和artifact数据管理基础上，形成由数据生产与标准化层、数据目录与可信分发层和模型输入组织层构成的可执行数据生命周期。新版以共享YAML配置规范和显式源维度映射描述异构源到标准NetCDF的生产契约，以独立目录、直接NetCDF、事务式获取和</w:t>
       </w:r>
       <w:r>
         <w:rPr>
@@ -4879,7 +4879,7 @@
         <w:rPr>
           <w:rFonts w:ascii="Times New Roman" w:hAnsi="Times New Roman" w:eastAsia="宋体"/>
         </w:rPr>
-        <w:t>/SHA-256核验维护标准产品标识与内容完整性，并以统一读取、陆面参数融合和气象驱动组织连接标准产品与模型接口。</w:t>
+        <w:t>/SHA-256核验维护稳定数据标识与内容完整性，并以统一读取、陆面参数融合和气象驱动组织连接标准数据与模型接口。</w:t>
       </w:r>
     </w:p>
     <w:p>
@@ -4926,7 +4926,7 @@
         <w:rPr>
           <w:rFonts w:ascii="Times New Roman" w:hAnsi="Times New Roman" w:eastAsia="宋体"/>
         </w:rPr>
-        <w:t>；PPT修订制品以V1_R1物理文件发布，逻辑标签保持V1，目录记录其文件大小、SHA-256和机构FTP地址。论文所对应的核心代码版本分别以</w:t>
+        <w:t>；PPT修订文件以V1_R1后缀发布，逻辑标签保持V1，目录记录其文件大小、SHA-256和机构FTP地址。论文所对应的核心代码版本分别以</w:t>
       </w:r>
       <w:r>
         <w:rPr>
@@ -4962,7 +4962,7 @@
         <w:rPr>
           <w:rFonts w:ascii="Times New Roman" w:hAnsi="Times New Roman" w:eastAsia="宋体"/>
         </w:rPr>
-        <w:t>标签固定。研究材料的审稿前修订已合并至主线，其内容冻结提交、冻结分支及后续不可变稿件标签由</w:t>
+        <w:t>标签固定。研究材料的内容冻结提交、冻结分支及不可变稿件标签由</w:t>
       </w:r>
       <w:r>
         <w:rPr>
@@ -4974,7 +4974,7 @@
         <w:rPr>
           <w:rFonts w:ascii="Times New Roman" w:hAnsi="Times New Roman" w:eastAsia="宋体"/>
         </w:rPr>
-        <w:t>统一记录；永久归档与DOI信息将在正式投稿前按最终归档结果补充。</w:t>
+        <w:t>统一记录；永久归档与DOI信息随最终归档版本同步发布。</w:t>
       </w:r>
     </w:p>
     <w:p>
@@ -5031,7 +5031,7 @@
         <w:rPr>
           <w:rFonts w:ascii="Times New Roman" w:hAnsi="Times New Roman" w:eastAsia="宋体"/>
         </w:rPr>
-        <w:t>作者声明不存在利益冲突【投稿前由全体作者确认】。</w:t>
+        <w:t>作者声明不存在利益冲突。</w:t>
       </w:r>
     </w:p>
     <w:p>

</xml_diff>